<commit_message>
Atualiza templates e form.html, adiciona .env sample e generated_docs
</commit_message>
<xml_diff>
--- a/app/docx_templates/CONCORDANCIA SALARIAL.docx
+++ b/app/docx_templates/CONCORDANCIA SALARIAL.docx
@@ -1502,7 +1502,7 @@
         <w:t>a</w:t>
       </w:r>
       <w:r>
-        <w:t>_id&gt;</w:t>
+        <w:t>_id</w:t>
       </w:r>
       <w:r>
         <w:rPr>
@@ -1758,7 +1758,7 @@
           </mc:Choice>
           <mc:Fallback>
             <w:pict>
-              <v:shape w14:anchorId="4E1A44E4" id="Graphic 1" o:spid="_x0000_s1026" style="position:absolute;margin-left:186.6pt;margin-top:13.95pt;width:269.3pt;height:.1pt;z-index:-15728640;visibility:visible;mso-wrap-style:square;mso-wrap-distance-left:0;mso-wrap-distance-top:0;mso-wrap-distance-right:0;mso-wrap-distance-bottom:0;mso-position-horizontal:absolute;mso-position-horizontal-relative:page;mso-position-vertical:absolute;mso-position-vertical-relative:text;v-text-anchor:top" coordsize="3420110,1270" o:gfxdata="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" path="m,l3419913,e" filled="f" strokeweight=".24725mm">
+              <v:shape w14:anchorId="4DD6C1B4" id="Graphic 1" o:spid="_x0000_s1026" style="position:absolute;margin-left:186.6pt;margin-top:13.95pt;width:269.3pt;height:.1pt;z-index:-15728640;visibility:visible;mso-wrap-style:square;mso-wrap-distance-left:0;mso-wrap-distance-top:0;mso-wrap-distance-right:0;mso-wrap-distance-bottom:0;mso-position-horizontal:absolute;mso-position-horizontal-relative:page;mso-position-vertical:absolute;mso-position-vertical-relative:text;v-text-anchor:top" coordsize="3420110,1270" o:gfxdata="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" path="m,l3419913,e" filled="f" strokeweight=".24725mm">
                 <v:path arrowok="t"/>
                 <w10:wrap type="topAndBottom" anchorx="page"/>
               </v:shape>

</xml_diff>